<commit_message>
Documentacion: manual del programador, diagramas de la base de datos y manual tecnico actualizado
- Manual del programador (36 pags): mapa del codigo, tareas, datos, API,
  recetas para extender el sistema, reglas de oro y pruebas.
- Diagrama de clases UML y modelo relacional de la base de datos, con
  diccionario de datos y relaciones (Word + imagenes + generadores).
- Manual tecnico: corrige que una franja puede cruzar la medianoche (el equipo
  la rechaza) y agrega el parche obligatorio de esp_hosted y como clonar el
  repositorio.
- Numeracion de listas que reinicia en 1 y recuadros que no se parten.
- Base de datos de ejemplo: campos del acudiente obligatorios y acentos
  corregidos en la tabla de usuarios.

Co-Authored-By: Claude Sonnet 5.5 <noreply@anthropic.com>
</commit_message>
<xml_diff>
--- a/ALIMETRIK-entrega/manuales/MANUAL-TECNICO.docx
+++ b/ALIMETRIK-entrega/manuales/MANUAL-TECNICO.docx
@@ -145,7 +145,7 @@
           <w:sz w:val="21"/>
           <w:szCs w:val="21"/>
         </w:rPr>
-        <w:t xml:space="preserve">Versión 2.0 · Agosto de 2026</w:t>
+        <w:t xml:space="preserve">Versión 2.1 · Octubre de 2026</w:t>
       </w:r>
     </w:p>
     <w:p>
@@ -1663,6 +1663,9 @@
         <w:gridCol w:w="9360"/>
       </w:tblGrid>
       <w:tr>
+        <w:trPr>
+          <w:cantSplit/>
+        </w:trPr>
         <w:tc>
           <w:tcPr>
             <w:tcW w:type="dxa" w:w="9360"/>
@@ -3582,6 +3585,38 @@
           <w:sz w:val="16"/>
           <w:szCs w:val="16"/>
         </w:rPr>
+        <w:t xml:space="preserve">idf.py reconfigure                      # descarga los componentes de WiFi</w:t>
+      </w:r>
+    </w:p>
+    <w:p>
+      <w:pPr>
+        <w:shd w:fill="F1F4F6" w:val="clear"/>
+        <w:spacing w:after="0" w:before="0" w:line="220"/>
+        <w:ind w:left="200" w:right="200"/>
+      </w:pPr>
+      <w:r>
+        <w:rPr>
+          <w:rFonts w:ascii="Courier New" w:cs="Courier New" w:eastAsia="Courier New" w:hAnsi="Courier New"/>
+          <w:color w:val="1A2733"/>
+          <w:sz w:val="16"/>
+          <w:szCs w:val="16"/>
+        </w:rPr>
+        <w:t xml:space="preserve">./parches/aplicar-parches.sh            # OBLIGATORIO (ver el recuadro siguiente)</w:t>
+      </w:r>
+    </w:p>
+    <w:p>
+      <w:pPr>
+        <w:shd w:fill="F1F4F6" w:val="clear"/>
+        <w:spacing w:after="0" w:before="0" w:line="220"/>
+        <w:ind w:left="200" w:right="200"/>
+      </w:pPr>
+      <w:r>
+        <w:rPr>
+          <w:rFonts w:ascii="Courier New" w:cs="Courier New" w:eastAsia="Courier New" w:hAnsi="Courier New"/>
+          <w:color w:val="1A2733"/>
+          <w:sz w:val="16"/>
+          <w:szCs w:val="16"/>
+        </w:rPr>
         <w:t xml:space="preserve">idf.py build                            # compila (5-10 min la primera vez)</w:t>
       </w:r>
     </w:p>
@@ -3673,6 +3708,9 @@
         <w:gridCol w:w="9360"/>
       </w:tblGrid>
       <w:tr>
+        <w:trPr>
+          <w:cantSplit/>
+        </w:trPr>
         <w:tc>
           <w:tcPr>
             <w:tcW w:type="dxa" w:w="9360"/>
@@ -3697,7 +3735,7 @@
                 <w:sz w:val="21"/>
                 <w:szCs w:val="21"/>
               </w:rPr>
-              <w:t xml:space="preserve">Si la grabación falla</w:t>
+              <w:t xml:space="preserve">El parche es obligatorio</w:t>
             </w:r>
           </w:p>
           <w:p>
@@ -3715,7 +3753,7 @@
                 <w:sz w:val="21"/>
                 <w:szCs w:val="21"/>
               </w:rPr>
-              <w:t xml:space="preserve">Compruebe que ningún otro programa tenga ocupado el puerto (monitor serie abierto, otra terminal). En Linux y macOS: </w:t>
+              <w:t xml:space="preserve">El componente de WiFi (</w:t>
             </w:r>
             <w:r>
               <w:rPr>
@@ -3728,7 +3766,7 @@
                 <w:sz w:val="21"/>
                 <w:szCs w:val="21"/>
               </w:rPr>
-              <w:t xml:space="preserve">lsof /dev/cu.usbserial-110</w:t>
+              <w:t xml:space="preserve">esp_hosted</w:t>
             </w:r>
             <w:r>
               <w:rPr>
@@ -3741,20 +3779,20 @@
                 <w:sz w:val="21"/>
                 <w:szCs w:val="21"/>
               </w:rPr>
-              <w:t xml:space="preserve"> y cierre el proceso. Si persiste, baje la velocidad a </w:t>
-            </w:r>
-            <w:r>
-              <w:rPr>
-                <w:rFonts w:ascii="Courier New" w:cs="Courier New" w:eastAsia="Courier New" w:hAnsi="Courier New"/>
-                <w:b w:val="false"/>
-                <w:bCs w:val="false"/>
+              <w:t xml:space="preserve">) arranca solo </w:t>
+            </w:r>
+            <w:r>
+              <w:rPr>
+                <w:rFonts w:ascii="Calibri" w:cs="Calibri" w:eastAsia="Calibri" w:hAnsi="Calibri"/>
+                <w:b/>
+                <w:bCs/>
                 <w:i w:val="false"/>
                 <w:iCs w:val="false"/>
                 <w:color w:val="444444"/>
                 <w:sz w:val="21"/>
                 <w:szCs w:val="21"/>
               </w:rPr>
-              <w:t xml:space="preserve">-b 115200</w:t>
+              <w:t xml:space="preserve">antes</w:t>
             </w:r>
             <w:r>
               <w:rPr>
@@ -3767,12 +3805,404 @@
                 <w:sz w:val="21"/>
                 <w:szCs w:val="21"/>
               </w:rPr>
-              <w:t xml:space="preserve">. El cable CH340 introduce ruido a velocidades altas.</w:t>
+              <w:t xml:space="preserve"> que el programa y agota la memoria interna: sin el parche la placa se reinicia en bucle y </w:t>
+            </w:r>
+            <w:r>
+              <w:rPr>
+                <w:rFonts w:ascii="Calibri" w:cs="Calibri" w:eastAsia="Calibri" w:hAnsi="Calibri"/>
+                <w:b/>
+                <w:bCs/>
+                <w:i w:val="false"/>
+                <w:iCs w:val="false"/>
+                <w:color w:val="444444"/>
+                <w:sz w:val="21"/>
+                <w:szCs w:val="21"/>
+              </w:rPr>
+              <w:t xml:space="preserve">nunca llega a funcionar</w:t>
+            </w:r>
+            <w:r>
+              <w:rPr>
+                <w:rFonts w:ascii="Calibri" w:cs="Calibri" w:eastAsia="Calibri" w:hAnsi="Calibri"/>
+                <w:b w:val="false"/>
+                <w:bCs w:val="false"/>
+                <w:i w:val="false"/>
+                <w:iCs w:val="false"/>
+                <w:color w:val="444444"/>
+                <w:sz w:val="21"/>
+                <w:szCs w:val="21"/>
+              </w:rPr>
+              <w:t xml:space="preserve">. El script </w:t>
+            </w:r>
+            <w:r>
+              <w:rPr>
+                <w:rFonts w:ascii="Courier New" w:cs="Courier New" w:eastAsia="Courier New" w:hAnsi="Courier New"/>
+                <w:b w:val="false"/>
+                <w:bCs w:val="false"/>
+                <w:i w:val="false"/>
+                <w:iCs w:val="false"/>
+                <w:color w:val="444444"/>
+                <w:sz w:val="21"/>
+                <w:szCs w:val="21"/>
+              </w:rPr>
+              <w:t xml:space="preserve">parches/aplicar-parches.sh</w:t>
+            </w:r>
+            <w:r>
+              <w:rPr>
+                <w:rFonts w:ascii="Calibri" w:cs="Calibri" w:eastAsia="Calibri" w:hAnsi="Calibri"/>
+                <w:b w:val="false"/>
+                <w:bCs w:val="false"/>
+                <w:i w:val="false"/>
+                <w:iCs w:val="false"/>
+                <w:color w:val="444444"/>
+                <w:sz w:val="21"/>
+                <w:szCs w:val="21"/>
+              </w:rPr>
+              <w:t xml:space="preserve"> lo aplica. Hay que repetirlo cada vez que se vuelvan a descargar los componentes (por ejemplo, después de borrar la carpeta </w:t>
+            </w:r>
+            <w:r>
+              <w:rPr>
+                <w:rFonts w:ascii="Courier New" w:cs="Courier New" w:eastAsia="Courier New" w:hAnsi="Courier New"/>
+                <w:b w:val="false"/>
+                <w:bCs w:val="false"/>
+                <w:i w:val="false"/>
+                <w:iCs w:val="false"/>
+                <w:color w:val="444444"/>
+                <w:sz w:val="21"/>
+                <w:szCs w:val="21"/>
+              </w:rPr>
+              <w:t xml:space="preserve">managed_components</w:t>
+            </w:r>
+            <w:r>
+              <w:rPr>
+                <w:rFonts w:ascii="Calibri" w:cs="Calibri" w:eastAsia="Calibri" w:hAnsi="Calibri"/>
+                <w:b w:val="false"/>
+                <w:bCs w:val="false"/>
+                <w:i w:val="false"/>
+                <w:iCs w:val="false"/>
+                <w:color w:val="444444"/>
+                <w:sz w:val="21"/>
+                <w:szCs w:val="21"/>
+              </w:rPr>
+              <w:t xml:space="preserve">).</w:t>
             </w:r>
           </w:p>
         </w:tc>
       </w:tr>
     </w:tbl>
+    <w:p>
+      <w:pPr>
+        <w:spacing w:after="120"/>
+      </w:pPr>
+    </w:p>
+    <w:tbl>
+      <w:tblPr>
+        <w:tblW w:type="dxa" w:w="9360"/>
+        <w:tblBorders>
+          <w:top w:val="single" w:color="D4A017" w:sz="6"/>
+          <w:left w:val="single" w:color="D4A017" w:sz="6"/>
+          <w:bottom w:val="single" w:color="D4A017" w:sz="6"/>
+          <w:right w:val="single" w:color="D4A017" w:sz="6"/>
+          <w:insideH w:val="none"/>
+          <w:insideV w:val="none"/>
+        </w:tblBorders>
+      </w:tblPr>
+      <w:tblGrid>
+        <w:gridCol w:w="9360"/>
+      </w:tblGrid>
+      <w:tr>
+        <w:trPr>
+          <w:cantSplit/>
+        </w:trPr>
+        <w:tc>
+          <w:tcPr>
+            <w:tcW w:type="dxa" w:w="9360"/>
+            <w:shd w:fill="FDF3DC" w:val="clear"/>
+            <w:tcMar>
+              <w:top w:type="dxa" w:w="140"/>
+              <w:left w:type="dxa" w:w="200"/>
+              <w:bottom w:type="dxa" w:w="140"/>
+              <w:right w:type="dxa" w:w="200"/>
+            </w:tcMar>
+          </w:tcPr>
+          <w:p>
+            <w:pPr>
+              <w:spacing w:after="60"/>
+            </w:pPr>
+            <w:r>
+              <w:rPr>
+                <w:rFonts w:ascii="Calibri" w:cs="Calibri" w:eastAsia="Calibri" w:hAnsi="Calibri"/>
+                <w:b/>
+                <w:bCs/>
+                <w:color w:val="17212B"/>
+                <w:sz w:val="21"/>
+                <w:szCs w:val="21"/>
+              </w:rPr>
+              <w:t xml:space="preserve">Si la grabación falla</w:t>
+            </w:r>
+          </w:p>
+          <w:p>
+            <w:pPr>
+              <w:spacing w:after="0" w:line="276"/>
+            </w:pPr>
+            <w:r>
+              <w:rPr>
+                <w:rFonts w:ascii="Calibri" w:cs="Calibri" w:eastAsia="Calibri" w:hAnsi="Calibri"/>
+                <w:b w:val="false"/>
+                <w:bCs w:val="false"/>
+                <w:i w:val="false"/>
+                <w:iCs w:val="false"/>
+                <w:color w:val="444444"/>
+                <w:sz w:val="21"/>
+                <w:szCs w:val="21"/>
+              </w:rPr>
+              <w:t xml:space="preserve">Compruebe que ningún otro programa tenga ocupado el puerto (monitor serie abierto, otra terminal). En Linux y macOS: </w:t>
+            </w:r>
+            <w:r>
+              <w:rPr>
+                <w:rFonts w:ascii="Courier New" w:cs="Courier New" w:eastAsia="Courier New" w:hAnsi="Courier New"/>
+                <w:b w:val="false"/>
+                <w:bCs w:val="false"/>
+                <w:i w:val="false"/>
+                <w:iCs w:val="false"/>
+                <w:color w:val="444444"/>
+                <w:sz w:val="21"/>
+                <w:szCs w:val="21"/>
+              </w:rPr>
+              <w:t xml:space="preserve">lsof /dev/cu.usbserial-110</w:t>
+            </w:r>
+            <w:r>
+              <w:rPr>
+                <w:rFonts w:ascii="Calibri" w:cs="Calibri" w:eastAsia="Calibri" w:hAnsi="Calibri"/>
+                <w:b w:val="false"/>
+                <w:bCs w:val="false"/>
+                <w:i w:val="false"/>
+                <w:iCs w:val="false"/>
+                <w:color w:val="444444"/>
+                <w:sz w:val="21"/>
+                <w:szCs w:val="21"/>
+              </w:rPr>
+              <w:t xml:space="preserve"> y cierre el proceso. Si persiste, baje la velocidad a </w:t>
+            </w:r>
+            <w:r>
+              <w:rPr>
+                <w:rFonts w:ascii="Courier New" w:cs="Courier New" w:eastAsia="Courier New" w:hAnsi="Courier New"/>
+                <w:b w:val="false"/>
+                <w:bCs w:val="false"/>
+                <w:i w:val="false"/>
+                <w:iCs w:val="false"/>
+                <w:color w:val="444444"/>
+                <w:sz w:val="21"/>
+                <w:szCs w:val="21"/>
+              </w:rPr>
+              <w:t xml:space="preserve">-b 115200</w:t>
+            </w:r>
+            <w:r>
+              <w:rPr>
+                <w:rFonts w:ascii="Calibri" w:cs="Calibri" w:eastAsia="Calibri" w:hAnsi="Calibri"/>
+                <w:b w:val="false"/>
+                <w:bCs w:val="false"/>
+                <w:i w:val="false"/>
+                <w:iCs w:val="false"/>
+                <w:color w:val="444444"/>
+                <w:sz w:val="21"/>
+                <w:szCs w:val="21"/>
+              </w:rPr>
+              <w:t xml:space="preserve">. El cable CH340 introduce ruido a velocidades altas.</w:t>
+            </w:r>
+          </w:p>
+        </w:tc>
+      </w:tr>
+    </w:tbl>
+    <w:p>
+      <w:pPr>
+        <w:pStyle w:val="Heading2"/>
+        <w:spacing w:after="120" w:before="260"/>
+      </w:pPr>
+      <w:r>
+        <w:rPr>
+          <w:rFonts w:ascii="Calibri" w:cs="Calibri" w:eastAsia="Calibri" w:hAnsi="Calibri"/>
+          <w:b/>
+          <w:bCs/>
+          <w:color w:val="0CA678"/>
+          <w:sz w:val="28"/>
+          <w:szCs w:val="28"/>
+        </w:rPr>
+        <w:t xml:space="preserve">4.3  Obtener el código desde GitHub</w:t>
+      </w:r>
+    </w:p>
+    <w:p>
+      <w:pPr>
+        <w:spacing w:after="140" w:line="288"/>
+      </w:pPr>
+      <w:r>
+        <w:rPr>
+          <w:rFonts w:ascii="Calibri" w:cs="Calibri" w:eastAsia="Calibri" w:hAnsi="Calibri"/>
+          <w:b w:val="false"/>
+          <w:bCs w:val="false"/>
+          <w:i w:val="false"/>
+          <w:iCs w:val="false"/>
+          <w:color w:val="444444"/>
+          <w:sz w:val="22"/>
+          <w:szCs w:val="22"/>
+        </w:rPr>
+        <w:t xml:space="preserve">El código completo está en un repositorio de GitHub. Para trabajar en otro computador:</w:t>
+      </w:r>
+    </w:p>
+    <w:p>
+      <w:pPr>
+        <w:pBdr>
+          <w:top w:val="single" w:color="D5DDE3" w:sz="4"/>
+        </w:pBdr>
+        <w:shd w:fill="F1F4F6" w:val="clear"/>
+        <w:spacing w:after="0" w:before="0" w:line="220"/>
+        <w:ind w:left="200" w:right="200"/>
+      </w:pPr>
+      <w:r>
+        <w:rPr>
+          <w:rFonts w:ascii="Courier New" w:cs="Courier New" w:eastAsia="Courier New" w:hAnsi="Courier New"/>
+          <w:color w:val="1A2733"/>
+          <w:sz w:val="16"/>
+          <w:szCs w:val="16"/>
+        </w:rPr>
+        <w:t xml:space="preserve">git clone https://github.com/HOSTINCIRO/alimetrik.git</w:t>
+      </w:r>
+    </w:p>
+    <w:p>
+      <w:pPr>
+        <w:shd w:fill="F1F4F6" w:val="clear"/>
+        <w:spacing w:after="0" w:before="0" w:line="220"/>
+        <w:ind w:left="200" w:right="200"/>
+      </w:pPr>
+      <w:r>
+        <w:rPr>
+          <w:rFonts w:ascii="Courier New" w:cs="Courier New" w:eastAsia="Courier New" w:hAnsi="Courier New"/>
+          <w:color w:val="1A2733"/>
+          <w:sz w:val="16"/>
+          <w:szCs w:val="16"/>
+        </w:rPr>
+        <w:t xml:space="preserve">cd alimetrik/test-driver-4500</w:t>
+      </w:r>
+    </w:p>
+    <w:p>
+      <w:pPr>
+        <w:pBdr>
+          <w:bottom w:val="single" w:color="D5DDE3" w:sz="4"/>
+        </w:pBdr>
+        <w:shd w:fill="F1F4F6" w:val="clear"/>
+        <w:spacing w:after="0" w:before="0" w:line="220"/>
+        <w:ind w:left="200" w:right="200"/>
+      </w:pPr>
+      <w:r>
+        <w:rPr>
+          <w:rFonts w:ascii="Courier New" w:cs="Courier New" w:eastAsia="Courier New" w:hAnsi="Courier New"/>
+          <w:color w:val="1A2733"/>
+          <w:sz w:val="16"/>
+          <w:szCs w:val="16"/>
+        </w:rPr>
+        <w:t xml:space="preserve"># después, los mismos pasos de 4.2: reconfigure, aplicar parche, build, flash</w:t>
+      </w:r>
+    </w:p>
+    <w:p>
+      <w:pPr>
+        <w:spacing w:after="100"/>
+      </w:pPr>
+    </w:p>
+    <w:p>
+      <w:pPr>
+        <w:spacing w:after="140" w:line="288"/>
+      </w:pPr>
+      <w:r>
+        <w:rPr>
+          <w:rFonts w:ascii="Calibri" w:cs="Calibri" w:eastAsia="Calibri" w:hAnsi="Calibri"/>
+          <w:b w:val="false"/>
+          <w:bCs w:val="false"/>
+          <w:i w:val="false"/>
+          <w:iCs w:val="false"/>
+          <w:color w:val="444444"/>
+          <w:sz w:val="22"/>
+          <w:szCs w:val="22"/>
+        </w:rPr>
+        <w:t xml:space="preserve">El repositorio es privado: para dar acceso a otra persona, en GitHub: </w:t>
+      </w:r>
+      <w:r>
+        <w:rPr>
+          <w:rFonts w:ascii="Calibri" w:cs="Calibri" w:eastAsia="Calibri" w:hAnsi="Calibri"/>
+          <w:b/>
+          <w:bCs/>
+          <w:i w:val="false"/>
+          <w:iCs w:val="false"/>
+          <w:color w:val="444444"/>
+          <w:sz w:val="22"/>
+          <w:szCs w:val="22"/>
+        </w:rPr>
+        <w:t xml:space="preserve">Settings → Collaborators → Add people</w:t>
+      </w:r>
+      <w:r>
+        <w:rPr>
+          <w:rFonts w:ascii="Calibri" w:cs="Calibri" w:eastAsia="Calibri" w:hAnsi="Calibri"/>
+          <w:b w:val="false"/>
+          <w:bCs w:val="false"/>
+          <w:i w:val="false"/>
+          <w:iCs w:val="false"/>
+          <w:color w:val="444444"/>
+          <w:sz w:val="22"/>
+          <w:szCs w:val="22"/>
+        </w:rPr>
+        <w:t xml:space="preserve">. No se suben las compilaciones (</w:t>
+      </w:r>
+      <w:r>
+        <w:rPr>
+          <w:rFonts w:ascii="Courier New" w:cs="Courier New" w:eastAsia="Courier New" w:hAnsi="Courier New"/>
+          <w:b w:val="false"/>
+          <w:bCs w:val="false"/>
+          <w:i w:val="false"/>
+          <w:iCs w:val="false"/>
+          <w:color w:val="444444"/>
+          <w:sz w:val="22"/>
+          <w:szCs w:val="22"/>
+        </w:rPr>
+        <w:t xml:space="preserve">build/</w:t>
+      </w:r>
+      <w:r>
+        <w:rPr>
+          <w:rFonts w:ascii="Calibri" w:cs="Calibri" w:eastAsia="Calibri" w:hAnsi="Calibri"/>
+          <w:b w:val="false"/>
+          <w:bCs w:val="false"/>
+          <w:i w:val="false"/>
+          <w:iCs w:val="false"/>
+          <w:color w:val="444444"/>
+          <w:sz w:val="22"/>
+          <w:szCs w:val="22"/>
+        </w:rPr>
+        <w:t xml:space="preserve">) ni los componentes descargados: se regeneran al compilar. Para entender el código por dentro, vea el </w:t>
+      </w:r>
+      <w:r>
+        <w:rPr>
+          <w:rFonts w:ascii="Calibri" w:cs="Calibri" w:eastAsia="Calibri" w:hAnsi="Calibri"/>
+          <w:b/>
+          <w:bCs/>
+          <w:i w:val="false"/>
+          <w:iCs w:val="false"/>
+          <w:color w:val="444444"/>
+          <w:sz w:val="22"/>
+          <w:szCs w:val="22"/>
+        </w:rPr>
+        <w:t xml:space="preserve">Manual del programador</w:t>
+      </w:r>
+      <w:r>
+        <w:rPr>
+          <w:rFonts w:ascii="Calibri" w:cs="Calibri" w:eastAsia="Calibri" w:hAnsi="Calibri"/>
+          <w:b w:val="false"/>
+          <w:bCs w:val="false"/>
+          <w:i w:val="false"/>
+          <w:iCs w:val="false"/>
+          <w:color w:val="444444"/>
+          <w:sz w:val="22"/>
+          <w:szCs w:val="22"/>
+        </w:rPr>
+        <w:t xml:space="preserve">.</w:t>
+      </w:r>
+    </w:p>
     <w:p>
       <w:pPr>
         <w:pStyle w:val="Heading1"/>
@@ -4103,6 +4533,9 @@
         <w:gridCol w:w="9360"/>
       </w:tblGrid>
       <w:tr>
+        <w:trPr>
+          <w:cantSplit/>
+        </w:trPr>
         <w:tc>
           <w:tcPr>
             <w:tcW w:type="dxa" w:w="9360"/>
@@ -4225,7 +4658,7 @@
         <w:pStyle w:val="ListParagraph"/>
         <w:numPr>
           <w:ilvl w:val="0"/>
-          <w:numId w:val="2"/>
+          <w:numId w:val="3"/>
         </w:numPr>
         <w:spacing w:after="110" w:line="276"/>
       </w:pPr>
@@ -4274,7 +4707,7 @@
         <w:pStyle w:val="ListParagraph"/>
         <w:numPr>
           <w:ilvl w:val="0"/>
-          <w:numId w:val="2"/>
+          <w:numId w:val="3"/>
         </w:numPr>
         <w:spacing w:after="110" w:line="276"/>
       </w:pPr>
@@ -4323,7 +4756,7 @@
         <w:pStyle w:val="ListParagraph"/>
         <w:numPr>
           <w:ilvl w:val="0"/>
-          <w:numId w:val="2"/>
+          <w:numId w:val="3"/>
         </w:numPr>
         <w:spacing w:after="110" w:line="276"/>
       </w:pPr>
@@ -4372,7 +4805,7 @@
         <w:pStyle w:val="ListParagraph"/>
         <w:numPr>
           <w:ilvl w:val="0"/>
-          <w:numId w:val="2"/>
+          <w:numId w:val="3"/>
         </w:numPr>
         <w:spacing w:after="110" w:line="276"/>
       </w:pPr>
@@ -5338,7 +5771,7 @@
         <w:pStyle w:val="ListParagraph"/>
         <w:numPr>
           <w:ilvl w:val="0"/>
-          <w:numId w:val="3"/>
+          <w:numId w:val="4"/>
         </w:numPr>
         <w:spacing w:after="90" w:line="276"/>
       </w:pPr>
@@ -5374,7 +5807,7 @@
         <w:pStyle w:val="ListParagraph"/>
         <w:numPr>
           <w:ilvl w:val="0"/>
-          <w:numId w:val="3"/>
+          <w:numId w:val="4"/>
         </w:numPr>
         <w:spacing w:after="90" w:line="276"/>
       </w:pPr>
@@ -5410,7 +5843,7 @@
         <w:pStyle w:val="ListParagraph"/>
         <w:numPr>
           <w:ilvl w:val="0"/>
-          <w:numId w:val="3"/>
+          <w:numId w:val="4"/>
         </w:numPr>
         <w:spacing w:after="90" w:line="276"/>
       </w:pPr>
@@ -5457,6 +5890,9 @@
         <w:gridCol w:w="9360"/>
       </w:tblGrid>
       <w:tr>
+        <w:trPr>
+          <w:cantSplit/>
+        </w:trPr>
         <w:tc>
           <w:tcPr>
             <w:tcW w:type="dxa" w:w="9360"/>
@@ -6297,6 +6733,9 @@
         <w:gridCol w:w="9360"/>
       </w:tblGrid>
       <w:tr>
+        <w:trPr>
+          <w:cantSplit/>
+        </w:trPr>
         <w:tc>
           <w:tcPr>
             <w:tcW w:type="dxa" w:w="9360"/>
@@ -7055,6 +7494,9 @@
         <w:gridCol w:w="9360"/>
       </w:tblGrid>
       <w:tr>
+        <w:trPr>
+          <w:cantSplit/>
+        </w:trPr>
         <w:tc>
           <w:tcPr>
             <w:tcW w:type="dxa" w:w="9360"/>
@@ -9033,6 +9475,9 @@
         <w:gridCol w:w="9360"/>
       </w:tblGrid>
       <w:tr>
+        <w:trPr>
+          <w:cantSplit/>
+        </w:trPr>
         <w:tc>
           <w:tcPr>
             <w:tcW w:type="dxa" w:w="9360"/>
@@ -9213,7 +9658,7 @@
         <w:pStyle w:val="ListParagraph"/>
         <w:numPr>
           <w:ilvl w:val="0"/>
-          <w:numId w:val="3"/>
+          <w:numId w:val="4"/>
         </w:numPr>
         <w:spacing w:after="90" w:line="276"/>
       </w:pPr>
@@ -9236,7 +9681,7 @@
         <w:pStyle w:val="ListParagraph"/>
         <w:numPr>
           <w:ilvl w:val="0"/>
-          <w:numId w:val="3"/>
+          <w:numId w:val="4"/>
         </w:numPr>
         <w:spacing w:after="90" w:line="276"/>
       </w:pPr>
@@ -9285,7 +9730,7 @@
         <w:pStyle w:val="ListParagraph"/>
         <w:numPr>
           <w:ilvl w:val="0"/>
-          <w:numId w:val="3"/>
+          <w:numId w:val="4"/>
         </w:numPr>
         <w:spacing w:after="90" w:line="276"/>
       </w:pPr>
@@ -9334,7 +9779,7 @@
         <w:pStyle w:val="ListParagraph"/>
         <w:numPr>
           <w:ilvl w:val="0"/>
-          <w:numId w:val="3"/>
+          <w:numId w:val="4"/>
         </w:numPr>
         <w:spacing w:after="90" w:line="276"/>
       </w:pPr>
@@ -9349,7 +9794,59 @@
           <w:sz w:val="22"/>
           <w:szCs w:val="22"/>
         </w:rPr>
-        <w:t xml:space="preserve">Un servicio puede cruzar la medianoche (por ejemplo 22:00 a 02:00); el modelo lo contempla.</w:t>
+        <w:t xml:space="preserve">La hora de inicio debe ser </w:t>
+      </w:r>
+      <w:r>
+        <w:rPr>
+          <w:rFonts w:ascii="Calibri" w:cs="Calibri" w:eastAsia="Calibri" w:hAnsi="Calibri"/>
+          <w:b/>
+          <w:bCs/>
+          <w:i w:val="false"/>
+          <w:iCs w:val="false"/>
+          <w:color w:val="444444"/>
+          <w:sz w:val="22"/>
+          <w:szCs w:val="22"/>
+        </w:rPr>
+        <w:t xml:space="preserve">anterior</w:t>
+      </w:r>
+      <w:r>
+        <w:rPr>
+          <w:rFonts w:ascii="Calibri" w:cs="Calibri" w:eastAsia="Calibri" w:hAnsi="Calibri"/>
+          <w:b w:val="false"/>
+          <w:bCs w:val="false"/>
+          <w:i w:val="false"/>
+          <w:iCs w:val="false"/>
+          <w:color w:val="444444"/>
+          <w:sz w:val="22"/>
+          <w:szCs w:val="22"/>
+        </w:rPr>
+        <w:t xml:space="preserve"> a la de fin: </w:t>
+      </w:r>
+      <w:r>
+        <w:rPr>
+          <w:rFonts w:ascii="Calibri" w:cs="Calibri" w:eastAsia="Calibri" w:hAnsi="Calibri"/>
+          <w:b/>
+          <w:bCs/>
+          <w:i w:val="false"/>
+          <w:iCs w:val="false"/>
+          <w:color w:val="444444"/>
+          <w:sz w:val="22"/>
+          <w:szCs w:val="22"/>
+        </w:rPr>
+        <w:t xml:space="preserve">no se acepta una franja que cruce la medianoche</w:t>
+      </w:r>
+      <w:r>
+        <w:rPr>
+          <w:rFonts w:ascii="Calibri" w:cs="Calibri" w:eastAsia="Calibri" w:hAnsi="Calibri"/>
+          <w:b w:val="false"/>
+          <w:bCs w:val="false"/>
+          <w:i w:val="false"/>
+          <w:iCs w:val="false"/>
+          <w:color w:val="444444"/>
+          <w:sz w:val="22"/>
+          <w:szCs w:val="22"/>
+        </w:rPr>
+        <w:t xml:space="preserve"> (por ejemplo 22:00 a 02:00). Si hiciera falta, se define como dos servicios: 22:00 a 24:00 y 00:00 a 02:00.</w:t>
       </w:r>
     </w:p>
     <w:p>
@@ -9357,7 +9854,7 @@
         <w:pStyle w:val="ListParagraph"/>
         <w:numPr>
           <w:ilvl w:val="0"/>
-          <w:numId w:val="3"/>
+          <w:numId w:val="4"/>
         </w:numPr>
         <w:spacing w:after="90" w:line="276"/>
       </w:pPr>
@@ -10068,6 +10565,9 @@
         <w:gridCol w:w="9360"/>
       </w:tblGrid>
       <w:tr>
+        <w:trPr>
+          <w:cantSplit/>
+        </w:trPr>
         <w:tc>
           <w:tcPr>
             <w:tcW w:type="dxa" w:w="9360"/>
@@ -12426,6 +12926,12 @@
     </w:lvlOverride>
   </w:num>
   <w:num w:numId="3">
+    <w:abstractNumId w:val="3"/>
+    <w:lvlOverride w:ilvl="0">
+      <w:startOverride w:val="1"/>
+    </w:lvlOverride>
+  </w:num>
+  <w:num w:numId="4">
     <w:abstractNumId w:val="2"/>
     <w:lvlOverride w:ilvl="0">
       <w:startOverride w:val="1"/>

</xml_diff>